<commit_message>
Correcciones de formato de la memoria
</commit_message>
<xml_diff>
--- a/documentos/Memoria_TFM_Eduardo_Flores_Carralero.docx
+++ b/documentos/Memoria_TFM_Eduardo_Flores_Carralero.docx
@@ -12,7 +12,7 @@
           <w:noProof/>
         </w:rPr>
         <w:drawing>
-          <wp:inline distT="0" distB="0" distL="0" distR="0" wp14:anchorId="1EE4589B" wp14:editId="3927EF4D">
+          <wp:inline distT="0" distB="0" distL="0" distR="0" wp14:anchorId="6B25F42F" wp14:editId="2A15B07B">
             <wp:extent cx="1657350" cy="628650"/>
             <wp:effectExtent l="0" t="0" r="0" b="0"/>
             <wp:docPr id="1" name="Imagen 1"/>
@@ -205,7 +205,7 @@
           <w:r>
             <w:fldChar w:fldCharType="separate"/>
           </w:r>
-          <w:hyperlink w:anchor="_Toc240410574" w:history="1">
+          <w:hyperlink w:anchor="_Toc240564953" w:history="1">
             <w:r>
               <w:rPr>
                 <w:rStyle w:val="Hipervnculo"/>
@@ -234,7 +234,7 @@
                 <w:noProof/>
                 <w:webHidden/>
               </w:rPr>
-              <w:instrText xml:space="preserve"> PAGEREF _Toc240410574 \h </w:instrText>
+              <w:instrText xml:space="preserve"> PAGEREF _Toc240564953 \h </w:instrText>
             </w:r>
             <w:r>
               <w:rPr>
@@ -276,7 +276,7 @@
               <w:noProof/>
             </w:rPr>
           </w:pPr>
-          <w:hyperlink w:anchor="_Toc240410575" w:history="1">
+          <w:hyperlink w:anchor="_Toc240564954" w:history="1">
             <w:r>
               <w:rPr>
                 <w:rStyle w:val="Hipervnculo"/>
@@ -305,7 +305,7 @@
                 <w:noProof/>
                 <w:webHidden/>
               </w:rPr>
-              <w:instrText xml:space="preserve"> PAGEREF _Toc240410575 \h </w:instrText>
+              <w:instrText xml:space="preserve"> PAGEREF _Toc240564954 \h </w:instrText>
             </w:r>
             <w:r>
               <w:rPr>
@@ -347,7 +347,7 @@
               <w:noProof/>
             </w:rPr>
           </w:pPr>
-          <w:hyperlink w:anchor="_Toc240410576" w:history="1">
+          <w:hyperlink w:anchor="_Toc240564955" w:history="1">
             <w:r>
               <w:rPr>
                 <w:rStyle w:val="Hipervnculo"/>
@@ -376,7 +376,7 @@
                 <w:noProof/>
                 <w:webHidden/>
               </w:rPr>
-              <w:instrText xml:space="preserve"> PAGEREF _Toc240410576 \h </w:instrText>
+              <w:instrText xml:space="preserve"> PAGEREF _Toc240564955 \h </w:instrText>
             </w:r>
             <w:r>
               <w:rPr>
@@ -418,7 +418,7 @@
               <w:noProof/>
             </w:rPr>
           </w:pPr>
-          <w:hyperlink w:anchor="_Toc240410577" w:history="1">
+          <w:hyperlink w:anchor="_Toc240564956" w:history="1">
             <w:r>
               <w:rPr>
                 <w:rStyle w:val="Hipervnculo"/>
@@ -447,7 +447,7 @@
                 <w:noProof/>
                 <w:webHidden/>
               </w:rPr>
-              <w:instrText xml:space="preserve"> PAGEREF _Toc240410577 \h </w:instrText>
+              <w:instrText xml:space="preserve"> PAGEREF _Toc240564956 \h </w:instrText>
             </w:r>
             <w:r>
               <w:rPr>
@@ -489,7 +489,7 @@
               <w:noProof/>
             </w:rPr>
           </w:pPr>
-          <w:hyperlink w:anchor="_Toc240410578" w:history="1">
+          <w:hyperlink w:anchor="_Toc240564957" w:history="1">
             <w:r>
               <w:rPr>
                 <w:rStyle w:val="Hipervnculo"/>
@@ -518,7 +518,7 @@
                 <w:noProof/>
                 <w:webHidden/>
               </w:rPr>
-              <w:instrText xml:space="preserve"> PAGEREF _Toc240410578 \h </w:instrText>
+              <w:instrText xml:space="preserve"> PAGEREF _Toc240564957 \h </w:instrText>
             </w:r>
             <w:r>
               <w:rPr>
@@ -560,7 +560,7 @@
               <w:noProof/>
             </w:rPr>
           </w:pPr>
-          <w:hyperlink w:anchor="_Toc240410579" w:history="1">
+          <w:hyperlink w:anchor="_Toc240564958" w:history="1">
             <w:r>
               <w:rPr>
                 <w:rStyle w:val="Hipervnculo"/>
@@ -589,7 +589,7 @@
                 <w:noProof/>
                 <w:webHidden/>
               </w:rPr>
-              <w:instrText xml:space="preserve"> PAGEREF _Toc240410579 \h </w:instrText>
+              <w:instrText xml:space="preserve"> PAGEREF _Toc240564958 \h </w:instrText>
             </w:r>
             <w:r>
               <w:rPr>
@@ -631,7 +631,7 @@
               <w:noProof/>
             </w:rPr>
           </w:pPr>
-          <w:hyperlink w:anchor="_Toc240410580" w:history="1">
+          <w:hyperlink w:anchor="_Toc240564959" w:history="1">
             <w:r>
               <w:rPr>
                 <w:rStyle w:val="Hipervnculo"/>
@@ -660,7 +660,7 @@
                 <w:noProof/>
                 <w:webHidden/>
               </w:rPr>
-              <w:instrText xml:space="preserve"> PAGEREF _Toc240410580 \h </w:instrText>
+              <w:instrText xml:space="preserve"> PAGEREF _Toc240564959 \h </w:instrText>
             </w:r>
             <w:r>
               <w:rPr>
@@ -702,7 +702,7 @@
               <w:noProof/>
             </w:rPr>
           </w:pPr>
-          <w:hyperlink w:anchor="_Toc240410581" w:history="1">
+          <w:hyperlink w:anchor="_Toc240564960" w:history="1">
             <w:r>
               <w:rPr>
                 <w:rStyle w:val="Hipervnculo"/>
@@ -731,7 +731,7 @@
                 <w:noProof/>
                 <w:webHidden/>
               </w:rPr>
-              <w:instrText xml:space="preserve"> PAGEREF _Toc240410581 \h </w:instrText>
+              <w:instrText xml:space="preserve"> PAGEREF _Toc240564960 \h </w:instrText>
             </w:r>
             <w:r>
               <w:rPr>
@@ -773,7 +773,7 @@
               <w:noProof/>
             </w:rPr>
           </w:pPr>
-          <w:hyperlink w:anchor="_Toc240410582" w:history="1">
+          <w:hyperlink w:anchor="_Toc240564961" w:history="1">
             <w:r>
               <w:rPr>
                 <w:rStyle w:val="Hipervnculo"/>
@@ -802,7 +802,7 @@
                 <w:noProof/>
                 <w:webHidden/>
               </w:rPr>
-              <w:instrText xml:space="preserve"> PAGEREF _Toc240410582 \h </w:instrText>
+              <w:instrText xml:space="preserve"> PAGEREF _Toc240564961 \h </w:instrText>
             </w:r>
             <w:r>
               <w:rPr>
@@ -844,7 +844,7 @@
               <w:noProof/>
             </w:rPr>
           </w:pPr>
-          <w:hyperlink w:anchor="_Toc240410583" w:history="1">
+          <w:hyperlink w:anchor="_Toc240564962" w:history="1">
             <w:r>
               <w:rPr>
                 <w:rStyle w:val="Hipervnculo"/>
@@ -873,7 +873,7 @@
                 <w:noProof/>
                 <w:webHidden/>
               </w:rPr>
-              <w:instrText xml:space="preserve"> PAGEREF _Toc240410583 \h </w:instrText>
+              <w:instrText xml:space="preserve"> PAGEREF _Toc240564962 \h </w:instrText>
             </w:r>
             <w:r>
               <w:rPr>
@@ -915,7 +915,7 @@
               <w:noProof/>
             </w:rPr>
           </w:pPr>
-          <w:hyperlink w:anchor="_Toc240410584" w:history="1">
+          <w:hyperlink w:anchor="_Toc240564963" w:history="1">
             <w:r>
               <w:rPr>
                 <w:rStyle w:val="Hipervnculo"/>
@@ -944,7 +944,7 @@
                 <w:noProof/>
                 <w:webHidden/>
               </w:rPr>
-              <w:instrText xml:space="preserve"> PAGEREF _Toc240410584 \h </w:instrText>
+              <w:instrText xml:space="preserve"> PAGEREF _Toc240564963 \h </w:instrText>
             </w:r>
             <w:r>
               <w:rPr>
@@ -986,7 +986,7 @@
               <w:noProof/>
             </w:rPr>
           </w:pPr>
-          <w:hyperlink w:anchor="_Toc240410585" w:history="1">
+          <w:hyperlink w:anchor="_Toc240564964" w:history="1">
             <w:r>
               <w:rPr>
                 <w:rStyle w:val="Hipervnculo"/>
@@ -1015,7 +1015,7 @@
                 <w:noProof/>
                 <w:webHidden/>
               </w:rPr>
-              <w:instrText xml:space="preserve"> PAGEREF _Toc240410585 \h </w:instrText>
+              <w:instrText xml:space="preserve"> PAGEREF _Toc240564964 \h </w:instrText>
             </w:r>
             <w:r>
               <w:rPr>
@@ -1057,7 +1057,7 @@
               <w:noProof/>
             </w:rPr>
           </w:pPr>
-          <w:hyperlink w:anchor="_Toc240410586" w:history="1">
+          <w:hyperlink w:anchor="_Toc240564965" w:history="1">
             <w:r>
               <w:rPr>
                 <w:rStyle w:val="Hipervnculo"/>
@@ -1086,7 +1086,7 @@
                 <w:noProof/>
                 <w:webHidden/>
               </w:rPr>
-              <w:instrText xml:space="preserve"> PAGEREF _Toc240410586 \h </w:instrText>
+              <w:instrText xml:space="preserve"> PAGEREF _Toc240564965 \h </w:instrText>
             </w:r>
             <w:r>
               <w:rPr>
@@ -1128,7 +1128,7 @@
               <w:noProof/>
             </w:rPr>
           </w:pPr>
-          <w:hyperlink w:anchor="_Toc240410587" w:history="1">
+          <w:hyperlink w:anchor="_Toc240564966" w:history="1">
             <w:r>
               <w:rPr>
                 <w:rStyle w:val="Hipervnculo"/>
@@ -1157,7 +1157,7 @@
                 <w:noProof/>
                 <w:webHidden/>
               </w:rPr>
-              <w:instrText xml:space="preserve"> PAGEREF _Toc240410587 \h </w:instrText>
+              <w:instrText xml:space="preserve"> PAGEREF _Toc240564966 \h </w:instrText>
             </w:r>
             <w:r>
               <w:rPr>
@@ -1199,7 +1199,7 @@
               <w:noProof/>
             </w:rPr>
           </w:pPr>
-          <w:hyperlink w:anchor="_Toc240410588" w:history="1">
+          <w:hyperlink w:anchor="_Toc240564967" w:history="1">
             <w:r>
               <w:rPr>
                 <w:rStyle w:val="Hipervnculo"/>
@@ -1228,7 +1228,7 @@
                 <w:noProof/>
                 <w:webHidden/>
               </w:rPr>
-              <w:instrText xml:space="preserve"> PAGEREF _Toc240410588 \h </w:instrText>
+              <w:instrText xml:space="preserve"> PAGEREF _Toc240564967 \h </w:instrText>
             </w:r>
             <w:r>
               <w:rPr>
@@ -1270,7 +1270,7 @@
               <w:noProof/>
             </w:rPr>
           </w:pPr>
-          <w:hyperlink w:anchor="_Toc240410589" w:history="1">
+          <w:hyperlink w:anchor="_Toc240564968" w:history="1">
             <w:r>
               <w:rPr>
                 <w:rStyle w:val="Hipervnculo"/>
@@ -1299,7 +1299,7 @@
                 <w:noProof/>
                 <w:webHidden/>
               </w:rPr>
-              <w:instrText xml:space="preserve"> PAGEREF _Toc240410589 \h </w:instrText>
+              <w:instrText xml:space="preserve"> PAGEREF _Toc240564968 \h </w:instrText>
             </w:r>
             <w:r>
               <w:rPr>
@@ -1341,7 +1341,7 @@
               <w:noProof/>
             </w:rPr>
           </w:pPr>
-          <w:hyperlink w:anchor="_Toc240410590" w:history="1">
+          <w:hyperlink w:anchor="_Toc240564969" w:history="1">
             <w:r>
               <w:rPr>
                 <w:rStyle w:val="Hipervnculo"/>
@@ -1370,7 +1370,7 @@
                 <w:noProof/>
                 <w:webHidden/>
               </w:rPr>
-              <w:instrText xml:space="preserve"> PAGEREF _Toc240410590 \h </w:instrText>
+              <w:instrText xml:space="preserve"> PAGEREF _Toc240564969 \h </w:instrText>
             </w:r>
             <w:r>
               <w:rPr>
@@ -1412,7 +1412,7 @@
               <w:noProof/>
             </w:rPr>
           </w:pPr>
-          <w:hyperlink w:anchor="_Toc240410591" w:history="1">
+          <w:hyperlink w:anchor="_Toc240564970" w:history="1">
             <w:r>
               <w:rPr>
                 <w:rStyle w:val="Hipervnculo"/>
@@ -1441,7 +1441,7 @@
                 <w:noProof/>
                 <w:webHidden/>
               </w:rPr>
-              <w:instrText xml:space="preserve"> PAGEREF _Toc240410591 \h </w:instrText>
+              <w:instrText xml:space="preserve"> PAGEREF _Toc240564970 \h </w:instrText>
             </w:r>
             <w:r>
               <w:rPr>
@@ -1483,7 +1483,7 @@
               <w:noProof/>
             </w:rPr>
           </w:pPr>
-          <w:hyperlink w:anchor="_Toc240410592" w:history="1">
+          <w:hyperlink w:anchor="_Toc240564971" w:history="1">
             <w:r>
               <w:rPr>
                 <w:rStyle w:val="Hipervnculo"/>
@@ -1512,7 +1512,7 @@
                 <w:noProof/>
                 <w:webHidden/>
               </w:rPr>
-              <w:instrText xml:space="preserve"> PAGEREF _Toc240410592 \h </w:instrText>
+              <w:instrText xml:space="preserve"> PAGEREF _Toc240564971 \h </w:instrText>
             </w:r>
             <w:r>
               <w:rPr>
@@ -1554,7 +1554,7 @@
               <w:noProof/>
             </w:rPr>
           </w:pPr>
-          <w:hyperlink w:anchor="_Toc240410593" w:history="1">
+          <w:hyperlink w:anchor="_Toc240564972" w:history="1">
             <w:r>
               <w:rPr>
                 <w:rStyle w:val="Hipervnculo"/>
@@ -1583,7 +1583,7 @@
                 <w:noProof/>
                 <w:webHidden/>
               </w:rPr>
-              <w:instrText xml:space="preserve"> PAGEREF _Toc240410593 \h </w:instrText>
+              <w:instrText xml:space="preserve"> PAGEREF _Toc240564972 \h </w:instrText>
             </w:r>
             <w:r>
               <w:rPr>
@@ -1625,7 +1625,7 @@
               <w:noProof/>
             </w:rPr>
           </w:pPr>
-          <w:hyperlink w:anchor="_Toc240410594" w:history="1">
+          <w:hyperlink w:anchor="_Toc240564973" w:history="1">
             <w:r>
               <w:rPr>
                 <w:rStyle w:val="Hipervnculo"/>
@@ -1654,7 +1654,7 @@
                 <w:noProof/>
                 <w:webHidden/>
               </w:rPr>
-              <w:instrText xml:space="preserve"> PAGEREF _Toc240410594 \h </w:instrText>
+              <w:instrText xml:space="preserve"> PAGEREF _Toc240564973 \h </w:instrText>
             </w:r>
             <w:r>
               <w:rPr>
@@ -1696,7 +1696,7 @@
               <w:noProof/>
             </w:rPr>
           </w:pPr>
-          <w:hyperlink w:anchor="_Toc240410595" w:history="1">
+          <w:hyperlink w:anchor="_Toc240564974" w:history="1">
             <w:r>
               <w:rPr>
                 <w:rStyle w:val="Hipervnculo"/>
@@ -1725,7 +1725,7 @@
                 <w:noProof/>
                 <w:webHidden/>
               </w:rPr>
-              <w:instrText xml:space="preserve"> PAGEREF _Toc240410595 \h </w:instrText>
+              <w:instrText xml:space="preserve"> PAGEREF _Toc240564974 \h </w:instrText>
             </w:r>
             <w:r>
               <w:rPr>
@@ -1767,7 +1767,7 @@
               <w:noProof/>
             </w:rPr>
           </w:pPr>
-          <w:hyperlink w:anchor="_Toc240410596" w:history="1">
+          <w:hyperlink w:anchor="_Toc240564975" w:history="1">
             <w:r>
               <w:rPr>
                 <w:rStyle w:val="Hipervnculo"/>
@@ -1796,7 +1796,7 @@
                 <w:noProof/>
                 <w:webHidden/>
               </w:rPr>
-              <w:instrText xml:space="preserve"> PAGEREF _Toc240410596 \h </w:instrText>
+              <w:instrText xml:space="preserve"> PAGEREF _Toc240564975 \h </w:instrText>
             </w:r>
             <w:r>
               <w:rPr>
@@ -1838,7 +1838,7 @@
               <w:noProof/>
             </w:rPr>
           </w:pPr>
-          <w:hyperlink w:anchor="_Toc240410597" w:history="1">
+          <w:hyperlink w:anchor="_Toc240564976" w:history="1">
             <w:r>
               <w:rPr>
                 <w:rStyle w:val="Hipervnculo"/>
@@ -1867,7 +1867,7 @@
                 <w:noProof/>
                 <w:webHidden/>
               </w:rPr>
-              <w:instrText xml:space="preserve"> PAGEREF _Toc240410597 \h </w:instrText>
+              <w:instrText xml:space="preserve"> PAGEREF _Toc240564976 \h </w:instrText>
             </w:r>
             <w:r>
               <w:rPr>
@@ -1909,7 +1909,7 @@
               <w:noProof/>
             </w:rPr>
           </w:pPr>
-          <w:hyperlink w:anchor="_Toc240410598" w:history="1">
+          <w:hyperlink w:anchor="_Toc240564977" w:history="1">
             <w:r>
               <w:rPr>
                 <w:rStyle w:val="Hipervnculo"/>
@@ -1938,7 +1938,7 @@
                 <w:noProof/>
                 <w:webHidden/>
               </w:rPr>
-              <w:instrText xml:space="preserve"> PAGEREF _Toc240410598 \h </w:instrText>
+              <w:instrText xml:space="preserve"> PAGEREF _Toc240564977 \h </w:instrText>
             </w:r>
             <w:r>
               <w:rPr>
@@ -1980,7 +1980,7 @@
               <w:noProof/>
             </w:rPr>
           </w:pPr>
-          <w:hyperlink w:anchor="_Toc240410599" w:history="1">
+          <w:hyperlink w:anchor="_Toc240564978" w:history="1">
             <w:r>
               <w:rPr>
                 <w:rStyle w:val="Hipervnculo"/>
@@ -2009,7 +2009,7 @@
                 <w:noProof/>
                 <w:webHidden/>
               </w:rPr>
-              <w:instrText xml:space="preserve"> PAGEREF _Toc240410599 \h </w:instrText>
+              <w:instrText xml:space="preserve"> PAGEREF _Toc240564978 \h </w:instrText>
             </w:r>
             <w:r>
               <w:rPr>
@@ -2051,7 +2051,7 @@
               <w:noProof/>
             </w:rPr>
           </w:pPr>
-          <w:hyperlink w:anchor="_Toc240410600" w:history="1">
+          <w:hyperlink w:anchor="_Toc240564979" w:history="1">
             <w:r>
               <w:rPr>
                 <w:rStyle w:val="Hipervnculo"/>
@@ -2080,7 +2080,7 @@
                 <w:noProof/>
                 <w:webHidden/>
               </w:rPr>
-              <w:instrText xml:space="preserve"> PAGEREF _Toc240410600 \h </w:instrText>
+              <w:instrText xml:space="preserve"> PAGEREF _Toc240564979 \h </w:instrText>
             </w:r>
             <w:r>
               <w:rPr>
@@ -2122,7 +2122,7 @@
               <w:noProof/>
             </w:rPr>
           </w:pPr>
-          <w:hyperlink w:anchor="_Toc240410601" w:history="1">
+          <w:hyperlink w:anchor="_Toc240564980" w:history="1">
             <w:r>
               <w:rPr>
                 <w:rStyle w:val="Hipervnculo"/>
@@ -2151,7 +2151,7 @@
                 <w:noProof/>
                 <w:webHidden/>
               </w:rPr>
-              <w:instrText xml:space="preserve"> PAGEREF _Toc240410601 \h </w:instrText>
+              <w:instrText xml:space="preserve"> PAGEREF _Toc240564980 \h </w:instrText>
             </w:r>
             <w:r>
               <w:rPr>
@@ -2193,7 +2193,7 @@
               <w:noProof/>
             </w:rPr>
           </w:pPr>
-          <w:hyperlink w:anchor="_Toc240410602" w:history="1">
+          <w:hyperlink w:anchor="_Toc240564981" w:history="1">
             <w:r>
               <w:rPr>
                 <w:rStyle w:val="Hipervnculo"/>
@@ -2222,7 +2222,7 @@
                 <w:noProof/>
                 <w:webHidden/>
               </w:rPr>
-              <w:instrText xml:space="preserve"> PAGEREF _Toc240410602 \h </w:instrText>
+              <w:instrText xml:space="preserve"> PAGEREF _Toc240564981 \h </w:instrText>
             </w:r>
             <w:r>
               <w:rPr>
@@ -2264,7 +2264,7 @@
               <w:noProof/>
             </w:rPr>
           </w:pPr>
-          <w:hyperlink w:anchor="_Toc240410603" w:history="1">
+          <w:hyperlink w:anchor="_Toc240564982" w:history="1">
             <w:r>
               <w:rPr>
                 <w:rStyle w:val="Hipervnculo"/>
@@ -2293,7 +2293,7 @@
                 <w:noProof/>
                 <w:webHidden/>
               </w:rPr>
-              <w:instrText xml:space="preserve"> PAGEREF _Toc240410603 \h </w:instrText>
+              <w:instrText xml:space="preserve"> PAGEREF _Toc240564982 \h </w:instrText>
             </w:r>
             <w:r>
               <w:rPr>
@@ -2335,7 +2335,7 @@
               <w:noProof/>
             </w:rPr>
           </w:pPr>
-          <w:hyperlink w:anchor="_Toc240410604" w:history="1">
+          <w:hyperlink w:anchor="_Toc240564983" w:history="1">
             <w:r>
               <w:rPr>
                 <w:rStyle w:val="Hipervnculo"/>
@@ -2364,7 +2364,7 @@
                 <w:noProof/>
                 <w:webHidden/>
               </w:rPr>
-              <w:instrText xml:space="preserve"> PAGEREF _Toc240410604 \h </w:instrText>
+              <w:instrText xml:space="preserve"> PAGEREF _Toc240564983 \h </w:instrText>
             </w:r>
             <w:r>
               <w:rPr>
@@ -2406,7 +2406,7 @@
               <w:noProof/>
             </w:rPr>
           </w:pPr>
-          <w:hyperlink w:anchor="_Toc240410605" w:history="1">
+          <w:hyperlink w:anchor="_Toc240564984" w:history="1">
             <w:r>
               <w:rPr>
                 <w:rStyle w:val="Hipervnculo"/>
@@ -2435,7 +2435,7 @@
                 <w:noProof/>
                 <w:webHidden/>
               </w:rPr>
-              <w:instrText xml:space="preserve"> PAGEREF _Toc240410605 \h </w:instrText>
+              <w:instrText xml:space="preserve"> PAGEREF _Toc240564984 \h </w:instrText>
             </w:r>
             <w:r>
               <w:rPr>
@@ -2477,7 +2477,7 @@
               <w:noProof/>
             </w:rPr>
           </w:pPr>
-          <w:hyperlink w:anchor="_Toc240410606" w:history="1">
+          <w:hyperlink w:anchor="_Toc240564985" w:history="1">
             <w:r>
               <w:rPr>
                 <w:rStyle w:val="Hipervnculo"/>
@@ -2506,7 +2506,7 @@
                 <w:noProof/>
                 <w:webHidden/>
               </w:rPr>
-              <w:instrText xml:space="preserve"> PAGEREF _Toc240410606 \h </w:instrText>
+              <w:instrText xml:space="preserve"> PAGEREF _Toc240564985 \h </w:instrText>
             </w:r>
             <w:r>
               <w:rPr>
@@ -2548,7 +2548,7 @@
               <w:noProof/>
             </w:rPr>
           </w:pPr>
-          <w:hyperlink w:anchor="_Toc240410607" w:history="1">
+          <w:hyperlink w:anchor="_Toc240564986" w:history="1">
             <w:r>
               <w:rPr>
                 <w:rStyle w:val="Hipervnculo"/>
@@ -2577,7 +2577,7 @@
                 <w:noProof/>
                 <w:webHidden/>
               </w:rPr>
-              <w:instrText xml:space="preserve"> PAGEREF _Toc240410607 \h </w:instrText>
+              <w:instrText xml:space="preserve"> PAGEREF _Toc240564986 \h </w:instrText>
             </w:r>
             <w:r>
               <w:rPr>
@@ -2619,7 +2619,7 @@
               <w:noProof/>
             </w:rPr>
           </w:pPr>
-          <w:hyperlink w:anchor="_Toc240410608" w:history="1">
+          <w:hyperlink w:anchor="_Toc240564987" w:history="1">
             <w:r>
               <w:rPr>
                 <w:rStyle w:val="Hipervnculo"/>
@@ -2648,7 +2648,7 @@
                 <w:noProof/>
                 <w:webHidden/>
               </w:rPr>
-              <w:instrText xml:space="preserve"> PAGEREF _Toc240410608 \h </w:instrText>
+              <w:instrText xml:space="preserve"> PAGEREF _Toc240564987 \h </w:instrText>
             </w:r>
             <w:r>
               <w:rPr>
@@ -2690,7 +2690,7 @@
               <w:noProof/>
             </w:rPr>
           </w:pPr>
-          <w:hyperlink w:anchor="_Toc240410609" w:history="1">
+          <w:hyperlink w:anchor="_Toc240564988" w:history="1">
             <w:r>
               <w:rPr>
                 <w:rStyle w:val="Hipervnculo"/>
@@ -2719,7 +2719,7 @@
                 <w:noProof/>
                 <w:webHidden/>
               </w:rPr>
-              <w:instrText xml:space="preserve"> PAGEREF _Toc240410609 \h </w:instrText>
+              <w:instrText xml:space="preserve"> PAGEREF _Toc240564988 \h </w:instrText>
             </w:r>
             <w:r>
               <w:rPr>
@@ -2761,7 +2761,7 @@
               <w:noProof/>
             </w:rPr>
           </w:pPr>
-          <w:hyperlink w:anchor="_Toc240410610" w:history="1">
+          <w:hyperlink w:anchor="_Toc240564989" w:history="1">
             <w:r>
               <w:rPr>
                 <w:rStyle w:val="Hipervnculo"/>
@@ -2790,7 +2790,7 @@
                 <w:noProof/>
                 <w:webHidden/>
               </w:rPr>
-              <w:instrText xml:space="preserve"> PAGEREF _Toc240410610 \h </w:instrText>
+              <w:instrText xml:space="preserve"> PAGEREF _Toc240564989 \h </w:instrText>
             </w:r>
             <w:r>
               <w:rPr>
@@ -2832,7 +2832,7 @@
               <w:noProof/>
             </w:rPr>
           </w:pPr>
-          <w:hyperlink w:anchor="_Toc240410611" w:history="1">
+          <w:hyperlink w:anchor="_Toc240564990" w:history="1">
             <w:r>
               <w:rPr>
                 <w:rStyle w:val="Hipervnculo"/>
@@ -2861,7 +2861,7 @@
                 <w:noProof/>
                 <w:webHidden/>
               </w:rPr>
-              <w:instrText xml:space="preserve"> PAGEREF _Toc240410611 \h </w:instrText>
+              <w:instrText xml:space="preserve"> PAGEREF _Toc240564990 \h </w:instrText>
             </w:r>
             <w:r>
               <w:rPr>
@@ -2903,7 +2903,7 @@
               <w:noProof/>
             </w:rPr>
           </w:pPr>
-          <w:hyperlink w:anchor="_Toc240410612" w:history="1">
+          <w:hyperlink w:anchor="_Toc240564991" w:history="1">
             <w:r>
               <w:rPr>
                 <w:rStyle w:val="Hipervnculo"/>
@@ -2932,7 +2932,7 @@
                 <w:noProof/>
                 <w:webHidden/>
               </w:rPr>
-              <w:instrText xml:space="preserve"> PAGEREF _Toc240410612 \h </w:instrText>
+              <w:instrText xml:space="preserve"> PAGEREF _Toc240564991 \h </w:instrText>
             </w:r>
             <w:r>
               <w:rPr>
@@ -2974,7 +2974,7 @@
               <w:noProof/>
             </w:rPr>
           </w:pPr>
-          <w:hyperlink w:anchor="_Toc240410613" w:history="1">
+          <w:hyperlink w:anchor="_Toc240564992" w:history="1">
             <w:r>
               <w:rPr>
                 <w:rStyle w:val="Hipervnculo"/>
@@ -3003,7 +3003,7 @@
                 <w:noProof/>
                 <w:webHidden/>
               </w:rPr>
-              <w:instrText xml:space="preserve"> PAGEREF _Toc240410613 \h </w:instrText>
+              <w:instrText xml:space="preserve"> PAGEREF _Toc240564992 \h </w:instrText>
             </w:r>
             <w:r>
               <w:rPr>
@@ -3045,7 +3045,7 @@
               <w:noProof/>
             </w:rPr>
           </w:pPr>
-          <w:hyperlink w:anchor="_Toc240410614" w:history="1">
+          <w:hyperlink w:anchor="_Toc240564993" w:history="1">
             <w:r>
               <w:rPr>
                 <w:rStyle w:val="Hipervnculo"/>
@@ -3074,7 +3074,7 @@
                 <w:noProof/>
                 <w:webHidden/>
               </w:rPr>
-              <w:instrText xml:space="preserve"> PAGEREF _Toc240410614 \h </w:instrText>
+              <w:instrText xml:space="preserve"> PAGEREF _Toc240564993 \h </w:instrText>
             </w:r>
             <w:r>
               <w:rPr>
@@ -3116,7 +3116,7 @@
               <w:noProof/>
             </w:rPr>
           </w:pPr>
-          <w:hyperlink w:anchor="_Toc240410615" w:history="1">
+          <w:hyperlink w:anchor="_Toc240564994" w:history="1">
             <w:r>
               <w:rPr>
                 <w:rStyle w:val="Hipervnculo"/>
@@ -3145,7 +3145,7 @@
                 <w:noProof/>
                 <w:webHidden/>
               </w:rPr>
-              <w:instrText xml:space="preserve"> PAGEREF _Toc240410615 \h </w:instrText>
+              <w:instrText xml:space="preserve"> PAGEREF _Toc240564994 \h </w:instrText>
             </w:r>
             <w:r>
               <w:rPr>
@@ -3187,7 +3187,7 @@
               <w:noProof/>
             </w:rPr>
           </w:pPr>
-          <w:hyperlink w:anchor="_Toc240410616" w:history="1">
+          <w:hyperlink w:anchor="_Toc240564995" w:history="1">
             <w:r>
               <w:rPr>
                 <w:rStyle w:val="Hipervnculo"/>
@@ -3216,7 +3216,7 @@
                 <w:noProof/>
                 <w:webHidden/>
               </w:rPr>
-              <w:instrText xml:space="preserve"> PAGEREF _Toc240410616 \h </w:instrText>
+              <w:instrText xml:space="preserve"> PAGEREF _Toc240564995 \h </w:instrText>
             </w:r>
             <w:r>
               <w:rPr>
@@ -3258,7 +3258,7 @@
               <w:noProof/>
             </w:rPr>
           </w:pPr>
-          <w:hyperlink w:anchor="_Toc240410617" w:history="1">
+          <w:hyperlink w:anchor="_Toc240564996" w:history="1">
             <w:r>
               <w:rPr>
                 <w:rStyle w:val="Hipervnculo"/>
@@ -3287,7 +3287,7 @@
                 <w:noProof/>
                 <w:webHidden/>
               </w:rPr>
-              <w:instrText xml:space="preserve"> PAGEREF _Toc240410617 \h </w:instrText>
+              <w:instrText xml:space="preserve"> PAGEREF _Toc240564996 \h </w:instrText>
             </w:r>
             <w:r>
               <w:rPr>
@@ -3329,7 +3329,7 @@
               <w:noProof/>
             </w:rPr>
           </w:pPr>
-          <w:hyperlink w:anchor="_Toc240410618" w:history="1">
+          <w:hyperlink w:anchor="_Toc240564997" w:history="1">
             <w:r>
               <w:rPr>
                 <w:rStyle w:val="Hipervnculo"/>
@@ -3358,7 +3358,7 @@
                 <w:noProof/>
                 <w:webHidden/>
               </w:rPr>
-              <w:instrText xml:space="preserve"> PAGEREF _Toc240410618 \h </w:instrText>
+              <w:instrText xml:space="preserve"> PAGEREF _Toc240564997 \h </w:instrText>
             </w:r>
             <w:r>
               <w:rPr>
@@ -3400,7 +3400,7 @@
               <w:noProof/>
             </w:rPr>
           </w:pPr>
-          <w:hyperlink w:anchor="_Toc240410619" w:history="1">
+          <w:hyperlink w:anchor="_Toc240564998" w:history="1">
             <w:r>
               <w:rPr>
                 <w:rStyle w:val="Hipervnculo"/>
@@ -3429,7 +3429,7 @@
                 <w:noProof/>
                 <w:webHidden/>
               </w:rPr>
-              <w:instrText xml:space="preserve"> PAGEREF _Toc240410619 \h </w:instrText>
+              <w:instrText xml:space="preserve"> PAGEREF _Toc240564998 \h </w:instrText>
             </w:r>
             <w:r>
               <w:rPr>
@@ -3471,7 +3471,7 @@
               <w:noProof/>
             </w:rPr>
           </w:pPr>
-          <w:hyperlink w:anchor="_Toc240410620" w:history="1">
+          <w:hyperlink w:anchor="_Toc240564999" w:history="1">
             <w:r>
               <w:rPr>
                 <w:rStyle w:val="Hipervnculo"/>
@@ -3500,7 +3500,7 @@
                 <w:noProof/>
                 <w:webHidden/>
               </w:rPr>
-              <w:instrText xml:space="preserve"> PAGEREF _Toc240410620 \h </w:instrText>
+              <w:instrText xml:space="preserve"> PAGEREF _Toc240564999 \h </w:instrText>
             </w:r>
             <w:r>
               <w:rPr>
@@ -3542,7 +3542,7 @@
               <w:noProof/>
             </w:rPr>
           </w:pPr>
-          <w:hyperlink w:anchor="_Toc240410621" w:history="1">
+          <w:hyperlink w:anchor="_Toc240565000" w:history="1">
             <w:r>
               <w:rPr>
                 <w:rStyle w:val="Hipervnculo"/>
@@ -3571,7 +3571,7 @@
                 <w:noProof/>
                 <w:webHidden/>
               </w:rPr>
-              <w:instrText xml:space="preserve"> PAGEREF _Toc240410621 \h </w:instrText>
+              <w:instrText xml:space="preserve"> PAGEREF _Toc240565000 \h </w:instrText>
             </w:r>
             <w:r>
               <w:rPr>
@@ -3613,7 +3613,7 @@
               <w:noProof/>
             </w:rPr>
           </w:pPr>
-          <w:hyperlink w:anchor="_Toc240410622" w:history="1">
+          <w:hyperlink w:anchor="_Toc240565001" w:history="1">
             <w:r>
               <w:rPr>
                 <w:rStyle w:val="Hipervnculo"/>
@@ -3642,7 +3642,7 @@
                 <w:noProof/>
                 <w:webHidden/>
               </w:rPr>
-              <w:instrText xml:space="preserve"> PAGEREF _Toc240410622 \h </w:instrText>
+              <w:instrText xml:space="preserve"> PAGEREF _Toc240565001 \h </w:instrText>
             </w:r>
             <w:r>
               <w:rPr>
@@ -3684,7 +3684,7 @@
               <w:noProof/>
             </w:rPr>
           </w:pPr>
-          <w:hyperlink w:anchor="_Toc240410623" w:history="1">
+          <w:hyperlink w:anchor="_Toc240565002" w:history="1">
             <w:r>
               <w:rPr>
                 <w:rStyle w:val="Hipervnculo"/>
@@ -3713,7 +3713,7 @@
                 <w:noProof/>
                 <w:webHidden/>
               </w:rPr>
-              <w:instrText xml:space="preserve"> PAGEREF _Toc240410623 \h </w:instrText>
+              <w:instrText xml:space="preserve"> PAGEREF _Toc240565002 \h </w:instrText>
             </w:r>
             <w:r>
               <w:rPr>
@@ -3755,7 +3755,7 @@
               <w:noProof/>
             </w:rPr>
           </w:pPr>
-          <w:hyperlink w:anchor="_Toc240410624" w:history="1">
+          <w:hyperlink w:anchor="_Toc240565003" w:history="1">
             <w:r>
               <w:rPr>
                 <w:rStyle w:val="Hipervnculo"/>
@@ -3784,7 +3784,7 @@
                 <w:noProof/>
                 <w:webHidden/>
               </w:rPr>
-              <w:instrText xml:space="preserve"> PAGEREF _Toc240410624 \h </w:instrText>
+              <w:instrText xml:space="preserve"> PAGEREF _Toc240565003 \h </w:instrText>
             </w:r>
             <w:r>
               <w:rPr>
@@ -3826,7 +3826,7 @@
               <w:noProof/>
             </w:rPr>
           </w:pPr>
-          <w:hyperlink w:anchor="_Toc240410625" w:history="1">
+          <w:hyperlink w:anchor="_Toc240565004" w:history="1">
             <w:r>
               <w:rPr>
                 <w:rStyle w:val="Hipervnculo"/>
@@ -3855,7 +3855,7 @@
                 <w:noProof/>
                 <w:webHidden/>
               </w:rPr>
-              <w:instrText xml:space="preserve"> PAGEREF _Toc240410625 \h </w:instrText>
+              <w:instrText xml:space="preserve"> PAGEREF _Toc240565004 \h </w:instrText>
             </w:r>
             <w:r>
               <w:rPr>
@@ -3897,7 +3897,7 @@
               <w:noProof/>
             </w:rPr>
           </w:pPr>
-          <w:hyperlink w:anchor="_Toc240410626" w:history="1">
+          <w:hyperlink w:anchor="_Toc240565005" w:history="1">
             <w:r>
               <w:rPr>
                 <w:rStyle w:val="Hipervnculo"/>
@@ -3926,7 +3926,7 @@
                 <w:noProof/>
                 <w:webHidden/>
               </w:rPr>
-              <w:instrText xml:space="preserve"> PAGEREF _Toc240410626 \h </w:instrText>
+              <w:instrText xml:space="preserve"> PAGEREF _Toc240565005 \h </w:instrText>
             </w:r>
             <w:r>
               <w:rPr>
@@ -3968,7 +3968,7 @@
               <w:noProof/>
             </w:rPr>
           </w:pPr>
-          <w:hyperlink w:anchor="_Toc240410627" w:history="1">
+          <w:hyperlink w:anchor="_Toc240565006" w:history="1">
             <w:r>
               <w:rPr>
                 <w:rStyle w:val="Hipervnculo"/>
@@ -3997,7 +3997,7 @@
                 <w:noProof/>
                 <w:webHidden/>
               </w:rPr>
-              <w:instrText xml:space="preserve"> PAGEREF _Toc240410627 \h </w:instrText>
+              <w:instrText xml:space="preserve"> PAGEREF _Toc240565006 \h </w:instrText>
             </w:r>
             <w:r>
               <w:rPr>
@@ -4039,7 +4039,7 @@
               <w:noProof/>
             </w:rPr>
           </w:pPr>
-          <w:hyperlink w:anchor="_Toc240410628" w:history="1">
+          <w:hyperlink w:anchor="_Toc240565007" w:history="1">
             <w:r>
               <w:rPr>
                 <w:rStyle w:val="Hipervnculo"/>
@@ -4068,7 +4068,7 @@
                 <w:noProof/>
                 <w:webHidden/>
               </w:rPr>
-              <w:instrText xml:space="preserve"> PAGEREF _Toc240410628 \h </w:instrText>
+              <w:instrText xml:space="preserve"> PAGEREF _Toc240565007 \h </w:instrText>
             </w:r>
             <w:r>
               <w:rPr>
@@ -4110,7 +4110,7 @@
               <w:noProof/>
             </w:rPr>
           </w:pPr>
-          <w:hyperlink w:anchor="_Toc240410629" w:history="1">
+          <w:hyperlink w:anchor="_Toc240565008" w:history="1">
             <w:r>
               <w:rPr>
                 <w:rStyle w:val="Hipervnculo"/>
@@ -4139,7 +4139,7 @@
                 <w:noProof/>
                 <w:webHidden/>
               </w:rPr>
-              <w:instrText xml:space="preserve"> PAGEREF _Toc240410629 \h </w:instrText>
+              <w:instrText xml:space="preserve"> PAGEREF _Toc240565008 \h </w:instrText>
             </w:r>
             <w:r>
               <w:rPr>
@@ -4181,7 +4181,7 @@
               <w:noProof/>
             </w:rPr>
           </w:pPr>
-          <w:hyperlink w:anchor="_Toc240410630" w:history="1">
+          <w:hyperlink w:anchor="_Toc240565009" w:history="1">
             <w:r>
               <w:rPr>
                 <w:rStyle w:val="Hipervnculo"/>
@@ -4210,7 +4210,7 @@
                 <w:noProof/>
                 <w:webHidden/>
               </w:rPr>
-              <w:instrText xml:space="preserve"> PAGEREF _Toc240410630 \h </w:instrText>
+              <w:instrText xml:space="preserve"> PAGEREF _Toc240565009 \h </w:instrText>
             </w:r>
             <w:r>
               <w:rPr>
@@ -4268,14 +4268,12 @@
         <w:pageBreakBefore/>
         <w:spacing w:after="240"/>
       </w:pPr>
-      <w:bookmarkStart w:id="0" w:name="_Toc240410574"/>
+      <w:bookmarkStart w:id="0" w:name="_Toc240564953"/>
       <w:r>
         <w:rPr>
           <w:b/>
           <w:bCs/>
           <w:color w:val="1F3864"/>
-          <w:sz w:val="36"/>
-          <w:szCs w:val="36"/>
         </w:rPr>
         <w:lastRenderedPageBreak/>
         <w:t>Resumen</w:t>
@@ -4307,14 +4305,12 @@
         <w:pStyle w:val="Ttulo2"/>
         <w:spacing w:before="280"/>
       </w:pPr>
-      <w:bookmarkStart w:id="1" w:name="_Toc240410575"/>
+      <w:bookmarkStart w:id="1" w:name="_Toc240564954"/>
       <w:r>
         <w:rPr>
           <w:b/>
           <w:bCs/>
           <w:color w:val="1F3864"/>
-          <w:sz w:val="32"/>
-          <w:szCs w:val="32"/>
         </w:rPr>
         <w:t>Abstract</w:t>
       </w:r>
@@ -4365,14 +4361,12 @@
         <w:pageBreakBefore/>
         <w:spacing w:after="240"/>
       </w:pPr>
-      <w:bookmarkStart w:id="2" w:name="_Toc240410576"/>
+      <w:bookmarkStart w:id="2" w:name="_Toc240564955"/>
       <w:r>
         <w:rPr>
           <w:b/>
           <w:bCs/>
           <w:color w:val="1F3864"/>
-          <w:sz w:val="36"/>
-          <w:szCs w:val="36"/>
         </w:rPr>
         <w:lastRenderedPageBreak/>
         <w:t>1. Introducción y antecedentes</w:t>
@@ -4384,14 +4378,12 @@
         <w:pStyle w:val="Ttulo2"/>
         <w:spacing w:before="280"/>
       </w:pPr>
-      <w:bookmarkStart w:id="3" w:name="_Toc240410577"/>
+      <w:bookmarkStart w:id="3" w:name="_Toc240564956"/>
       <w:r>
         <w:rPr>
           <w:b/>
           <w:bCs/>
           <w:color w:val="1F3864"/>
-          <w:sz w:val="32"/>
-          <w:szCs w:val="32"/>
         </w:rPr>
         <w:t>1.1. El transporte por carretera y las emisiones de CO₂ en la Unión Europea</w:t>
       </w:r>
@@ -4417,14 +4409,12 @@
         <w:pStyle w:val="Ttulo2"/>
         <w:spacing w:before="280"/>
       </w:pPr>
-      <w:bookmarkStart w:id="4" w:name="_Toc240410578"/>
+      <w:bookmarkStart w:id="4" w:name="_Toc240564957"/>
       <w:r>
         <w:rPr>
           <w:b/>
           <w:bCs/>
           <w:color w:val="1F3864"/>
-          <w:sz w:val="32"/>
-          <w:szCs w:val="32"/>
         </w:rPr>
         <w:t>1.2. El marco regulatorio: el Reglamento (UE) 2019/631</w:t>
       </w:r>
@@ -4748,14 +4738,12 @@
         <w:pStyle w:val="Ttulo2"/>
         <w:spacing w:before="280"/>
       </w:pPr>
-      <w:bookmarkStart w:id="5" w:name="_Toc240410579"/>
+      <w:bookmarkStart w:id="5" w:name="_Toc240564958"/>
       <w:r>
         <w:rPr>
           <w:b/>
           <w:bCs/>
           <w:color w:val="1F3864"/>
-          <w:sz w:val="32"/>
-          <w:szCs w:val="32"/>
         </w:rPr>
         <w:t>1.3. La transición de NEDC a WLTP</w:t>
       </w:r>
@@ -4787,14 +4775,12 @@
         <w:pStyle w:val="Ttulo2"/>
         <w:spacing w:before="280"/>
       </w:pPr>
-      <w:bookmarkStart w:id="6" w:name="_Toc240410580"/>
+      <w:bookmarkStart w:id="6" w:name="_Toc240564959"/>
       <w:r>
         <w:rPr>
           <w:b/>
           <w:bCs/>
           <w:color w:val="1F3864"/>
-          <w:sz w:val="32"/>
-          <w:szCs w:val="32"/>
         </w:rPr>
         <w:t>1.4. Antecedentes: aprendizaje automático aplicado a la predicción de emisiones</w:t>
       </w:r>
@@ -4834,14 +4820,12 @@
         <w:pStyle w:val="Ttulo2"/>
         <w:spacing w:before="280"/>
       </w:pPr>
-      <w:bookmarkStart w:id="7" w:name="_Toc240410581"/>
+      <w:bookmarkStart w:id="7" w:name="_Toc240564960"/>
       <w:r>
         <w:rPr>
           <w:b/>
           <w:bCs/>
           <w:color w:val="1F3864"/>
-          <w:sz w:val="32"/>
-          <w:szCs w:val="32"/>
         </w:rPr>
         <w:t>1.5. Justificación y aportación del presente trabajo</w:t>
       </w:r>
@@ -4878,14 +4862,12 @@
         <w:pageBreakBefore/>
         <w:spacing w:after="240"/>
       </w:pPr>
-      <w:bookmarkStart w:id="8" w:name="_Toc240410582"/>
+      <w:bookmarkStart w:id="8" w:name="_Toc240564961"/>
       <w:r>
         <w:rPr>
           <w:b/>
           <w:bCs/>
           <w:color w:val="1F3864"/>
-          <w:sz w:val="36"/>
-          <w:szCs w:val="36"/>
         </w:rPr>
         <w:lastRenderedPageBreak/>
         <w:t>2. Objetivos del proyecto</w:t>
@@ -4897,14 +4879,12 @@
         <w:pStyle w:val="Ttulo2"/>
         <w:spacing w:before="280"/>
       </w:pPr>
-      <w:bookmarkStart w:id="9" w:name="_Toc240410583"/>
+      <w:bookmarkStart w:id="9" w:name="_Toc240564962"/>
       <w:r>
         <w:rPr>
           <w:b/>
           <w:bCs/>
           <w:color w:val="1F3864"/>
-          <w:sz w:val="32"/>
-          <w:szCs w:val="32"/>
         </w:rPr>
         <w:t>2.1. Objetivo general</w:t>
       </w:r>
@@ -4920,14 +4900,12 @@
         <w:pStyle w:val="Ttulo2"/>
         <w:spacing w:before="280"/>
       </w:pPr>
-      <w:bookmarkStart w:id="10" w:name="_Toc240410584"/>
+      <w:bookmarkStart w:id="10" w:name="_Toc240564963"/>
       <w:r>
         <w:rPr>
           <w:b/>
           <w:bCs/>
           <w:color w:val="1F3864"/>
-          <w:sz w:val="32"/>
-          <w:szCs w:val="32"/>
         </w:rPr>
         <w:t>2.2. Objetivos específicos</w:t>
       </w:r>
@@ -4940,7 +4918,6 @@
           <w:ilvl w:val="0"/>
           <w:numId w:val="2"/>
         </w:numPr>
-        <w:spacing w:after="60"/>
       </w:pPr>
       <w:r>
         <w:t>Construir un proceso reproducible de adquisición, validación y preparación de los datos que publica la Agencia Europea de Medio Ambiente.</w:t>
@@ -4953,7 +4930,6 @@
           <w:ilvl w:val="0"/>
           <w:numId w:val="2"/>
         </w:numPr>
-        <w:spacing w:after="60"/>
       </w:pPr>
       <w:r>
         <w:t>Caracterizar, mediante análisis exploratorio, la distribución de las emisiones y su relación con las variables técnicas del vehículo, además de su evolución a lo largo del periodo de vigencia de la metodología WLTP.</w:t>
@@ -4966,7 +4942,6 @@
           <w:ilvl w:val="0"/>
           <w:numId w:val="2"/>
         </w:numPr>
-        <w:spacing w:after="60"/>
       </w:pPr>
       <w:r>
         <w:t>Contrastar estadísticamente las diferencias de emisiones entre tipos de combustible, atendiendo tanto a la significación como al tamaño del efecto.</w:t>
@@ -4979,7 +4954,6 @@
           <w:ilvl w:val="0"/>
           <w:numId w:val="2"/>
         </w:numPr>
-        <w:spacing w:after="60"/>
       </w:pPr>
       <w:r>
         <w:t>Entrenar y comparar modelos de regresión de complejidad creciente para estimar las emisiones, evaluando en cada caso el equilibrio entre capacidad predictiva e interpretabilidad.</w:t>
@@ -4992,7 +4966,6 @@
           <w:ilvl w:val="0"/>
           <w:numId w:val="2"/>
         </w:numPr>
-        <w:spacing w:after="60"/>
       </w:pPr>
       <w:r>
         <w:t>Segmentar los vehículos en grupos homogéneos a partir de su perfil conjunto de emisiones, masa, potencia y cilindrada.</w:t>
@@ -5005,7 +4978,6 @@
           <w:ilvl w:val="0"/>
           <w:numId w:val="2"/>
         </w:numPr>
-        <w:spacing w:after="60"/>
       </w:pPr>
       <w:r>
         <w:t>Traducir los resultados obtenidos a conclusiones interpretables tanto en términos de negocio como de cumplimiento regulatorio.</w:t>
@@ -5017,14 +4989,12 @@
         <w:pageBreakBefore/>
         <w:spacing w:after="240"/>
       </w:pPr>
-      <w:bookmarkStart w:id="11" w:name="_Toc240410585"/>
+      <w:bookmarkStart w:id="11" w:name="_Toc240564964"/>
       <w:r>
         <w:rPr>
           <w:b/>
           <w:bCs/>
           <w:color w:val="1F3864"/>
-          <w:sz w:val="36"/>
-          <w:szCs w:val="36"/>
         </w:rPr>
         <w:lastRenderedPageBreak/>
         <w:t>3. Material y métodos</w:t>
@@ -5036,14 +5006,12 @@
         <w:pStyle w:val="Ttulo2"/>
         <w:spacing w:before="280"/>
       </w:pPr>
-      <w:bookmarkStart w:id="12" w:name="_Toc240410586"/>
+      <w:bookmarkStart w:id="12" w:name="_Toc240564965"/>
       <w:r>
         <w:rPr>
           <w:b/>
           <w:bCs/>
           <w:color w:val="1F3864"/>
-          <w:sz w:val="32"/>
-          <w:szCs w:val="32"/>
         </w:rPr>
         <w:t>3.1. Fuente de datos</w:t>
       </w:r>
@@ -7820,14 +7788,12 @@
         <w:pStyle w:val="Ttulo2"/>
         <w:spacing w:before="280"/>
       </w:pPr>
-      <w:bookmarkStart w:id="13" w:name="_Toc240410587"/>
+      <w:bookmarkStart w:id="13" w:name="_Toc240564966"/>
       <w:r>
         <w:rPr>
           <w:b/>
           <w:bCs/>
           <w:color w:val="1F3864"/>
-          <w:sz w:val="32"/>
-          <w:szCs w:val="32"/>
         </w:rPr>
         <w:t>3.2. Entorno de trabajo y tecnologías empleadas</w:t>
       </w:r>
@@ -8584,14 +8550,12 @@
         <w:pStyle w:val="Ttulo2"/>
         <w:spacing w:before="280"/>
       </w:pPr>
-      <w:bookmarkStart w:id="14" w:name="_Toc240410588"/>
+      <w:bookmarkStart w:id="14" w:name="_Toc240564967"/>
       <w:r>
         <w:rPr>
           <w:b/>
           <w:bCs/>
           <w:color w:val="1F3864"/>
-          <w:sz w:val="32"/>
-          <w:szCs w:val="32"/>
         </w:rPr>
         <w:t>3.3. Estrategia de acceso y dimensionamiento de la muestra</w:t>
       </w:r>
@@ -8648,14 +8612,12 @@
         <w:pStyle w:val="Ttulo2"/>
         <w:spacing w:before="280"/>
       </w:pPr>
-      <w:bookmarkStart w:id="15" w:name="_Toc240410589"/>
+      <w:bookmarkStart w:id="15" w:name="_Toc240564968"/>
       <w:r>
         <w:rPr>
           <w:b/>
           <w:bCs/>
           <w:color w:val="1F3864"/>
-          <w:sz w:val="32"/>
-          <w:szCs w:val="32"/>
         </w:rPr>
         <w:t>3.4. Metodología de análisis</w:t>
       </w:r>
@@ -11448,14 +11410,12 @@
         <w:pStyle w:val="Ttulo2"/>
         <w:spacing w:before="280"/>
       </w:pPr>
-      <w:bookmarkStart w:id="16" w:name="_Toc240410590"/>
+      <w:bookmarkStart w:id="16" w:name="_Toc240564969"/>
       <w:r>
         <w:rPr>
           <w:b/>
           <w:bCs/>
           <w:color w:val="1F3864"/>
-          <w:sz w:val="32"/>
-          <w:szCs w:val="32"/>
         </w:rPr>
         <w:t>3.5. Reproducibilidad</w:t>
       </w:r>
@@ -11468,7 +11428,13 @@
     </w:p>
     <w:p>
       <w:r>
-        <w:t xml:space="preserve">El conjunto del código, los siete cuadernos de análisis, los tres scripts de la cadena de datos y las figuras generadas están publicados en el repositorio https://github.com/DuduFlo-18/tfm-emisiones-co2-ue, junto con las instrucciones de instalación y el fichero de dependencias. Los datos no se versionan: se regeneran íntegramente ejecutando la cadena de extracción, de modo que el repositorio contiene el procedimiento y no una copia de la fuente.</w:t>
+        <w:t>El conjunto del código, los siete cuadernos de análisis, los tres scripts de la c</w:t>
+      </w:r>
+      <w:r>
+        <w:t>adena de datos y las figuras generadas están publicados en el repositorio https://github.com/DuduFlo-18/tfm-emisiones-co2-ue, junto con las instrucciones de instalación y el fichero de dependencias. Los datos no se versionan: se regeneran íntegramente ejec</w:t>
+      </w:r>
+      <w:r>
+        <w:t>utando la cadena de extracción, de modo que el repositorio contiene el procedimiento y no una copia de la fuente.</w:t>
       </w:r>
     </w:p>
     <w:p>
@@ -11477,14 +11443,12 @@
         <w:pageBreakBefore/>
         <w:spacing w:after="240"/>
       </w:pPr>
-      <w:bookmarkStart w:id="17" w:name="_Toc240410591"/>
+      <w:bookmarkStart w:id="17" w:name="_Toc240564970"/>
       <w:r>
         <w:rPr>
           <w:b/>
           <w:bCs/>
           <w:color w:val="1F3864"/>
-          <w:sz w:val="36"/>
-          <w:szCs w:val="36"/>
         </w:rPr>
         <w:lastRenderedPageBreak/>
         <w:t>4. Resultados</w:t>
@@ -11496,14 +11460,12 @@
         <w:pStyle w:val="Ttulo2"/>
         <w:spacing w:before="280"/>
       </w:pPr>
-      <w:bookmarkStart w:id="18" w:name="_Toc240410592"/>
+      <w:bookmarkStart w:id="18" w:name="_Toc240564971"/>
       <w:r>
         <w:rPr>
           <w:b/>
           <w:bCs/>
           <w:color w:val="1F3864"/>
-          <w:sz w:val="32"/>
-          <w:szCs w:val="32"/>
         </w:rPr>
         <w:t>4.1. Adquisición de las fuentes de datos</w:t>
       </w:r>
@@ -11534,14 +11496,12 @@
         <w:pStyle w:val="Ttulo2"/>
         <w:spacing w:before="280"/>
       </w:pPr>
-      <w:bookmarkStart w:id="19" w:name="_Toc240410593"/>
+      <w:bookmarkStart w:id="19" w:name="_Toc240564972"/>
       <w:r>
         <w:rPr>
           <w:b/>
           <w:bCs/>
           <w:color w:val="1F3864"/>
-          <w:sz w:val="32"/>
-          <w:szCs w:val="32"/>
         </w:rPr>
         <w:t>4.2. Descripción de las fuentes de datos</w:t>
       </w:r>
@@ -12808,14 +12768,12 @@
         <w:pStyle w:val="Ttulo2"/>
         <w:spacing w:before="280"/>
       </w:pPr>
-      <w:bookmarkStart w:id="20" w:name="_Toc240410594"/>
+      <w:bookmarkStart w:id="20" w:name="_Toc240564973"/>
       <w:r>
         <w:rPr>
           <w:b/>
           <w:bCs/>
           <w:color w:val="1F3864"/>
-          <w:sz w:val="32"/>
-          <w:szCs w:val="32"/>
         </w:rPr>
         <w:t>4.3. Análisis exploratorio de datos</w:t>
       </w:r>
@@ -12837,7 +12795,7 @@
         </w:rPr>
         <w:lastRenderedPageBreak/>
         <w:drawing>
-          <wp:inline distT="0" distB="0" distL="0" distR="0" wp14:anchorId="4C143144" wp14:editId="3DB2E4CE">
+          <wp:inline distT="0" distB="0" distL="0" distR="0" wp14:anchorId="1D201D67" wp14:editId="7414AD2A">
             <wp:extent cx="5524500" cy="2524125"/>
             <wp:effectExtent l="0" t="0" r="0" b="0"/>
             <wp:docPr id="2" name="Imagen 2"/>
@@ -12915,7 +12873,7 @@
         </w:rPr>
         <w:lastRenderedPageBreak/>
         <w:drawing>
-          <wp:inline distT="0" distB="0" distL="0" distR="0" wp14:anchorId="13008A48" wp14:editId="16C59EA9">
+          <wp:inline distT="0" distB="0" distL="0" distR="0" wp14:anchorId="58441FAA" wp14:editId="487F9CE4">
             <wp:extent cx="5524500" cy="2905125"/>
             <wp:effectExtent l="0" t="0" r="0" b="0"/>
             <wp:docPr id="3" name="Imagen 3"/>
@@ -12987,7 +12945,7 @@
         <w:pStyle w:val="Ttulo3"/>
         <w:spacing w:before="240"/>
       </w:pPr>
-      <w:bookmarkStart w:id="21" w:name="_Toc240410595"/>
+      <w:bookmarkStart w:id="21" w:name="_Toc240564974"/>
       <w:r>
         <w:rPr>
           <w:b/>
@@ -13014,7 +12972,7 @@
         </w:rPr>
         <w:lastRenderedPageBreak/>
         <w:drawing>
-          <wp:inline distT="0" distB="0" distL="0" distR="0" wp14:anchorId="36647D35" wp14:editId="48241C7E">
+          <wp:inline distT="0" distB="0" distL="0" distR="0" wp14:anchorId="62B2B264" wp14:editId="7C727ED1">
             <wp:extent cx="4953000" cy="3486150"/>
             <wp:effectExtent l="0" t="0" r="0" b="0"/>
             <wp:docPr id="4" name="Imagen 4"/>
@@ -13081,7 +13039,7 @@
         <w:pStyle w:val="Ttulo3"/>
         <w:spacing w:before="240"/>
       </w:pPr>
-      <w:bookmarkStart w:id="22" w:name="_Toc240410596"/>
+      <w:bookmarkStart w:id="22" w:name="_Toc240564975"/>
       <w:r>
         <w:rPr>
           <w:b/>
@@ -13126,7 +13084,7 @@
         <w:pStyle w:val="Ttulo3"/>
         <w:spacing w:before="240"/>
       </w:pPr>
-      <w:bookmarkStart w:id="23" w:name="_Toc240410597"/>
+      <w:bookmarkStart w:id="23" w:name="_Toc240564976"/>
       <w:r>
         <w:rPr>
           <w:b/>
@@ -13158,7 +13116,7 @@
         </w:rPr>
         <w:lastRenderedPageBreak/>
         <w:drawing>
-          <wp:inline distT="0" distB="0" distL="0" distR="0" wp14:anchorId="2C65D721" wp14:editId="59FAE028">
+          <wp:inline distT="0" distB="0" distL="0" distR="0" wp14:anchorId="4F78059F" wp14:editId="4A7C7B9A">
             <wp:extent cx="5524500" cy="2971800"/>
             <wp:effectExtent l="0" t="0" r="0" b="0"/>
             <wp:docPr id="5" name="Imagen 5"/>
@@ -13670,7 +13628,7 @@
         <w:pStyle w:val="Ttulo3"/>
         <w:spacing w:before="240"/>
       </w:pPr>
-      <w:bookmarkStart w:id="24" w:name="_Toc240410598"/>
+      <w:bookmarkStart w:id="24" w:name="_Toc240564977"/>
       <w:r>
         <w:rPr>
           <w:b/>
@@ -13697,7 +13655,7 @@
         </w:rPr>
         <w:lastRenderedPageBreak/>
         <w:drawing>
-          <wp:inline distT="0" distB="0" distL="0" distR="0" wp14:anchorId="08765034" wp14:editId="3DEF7D0F">
+          <wp:inline distT="0" distB="0" distL="0" distR="0" wp14:anchorId="249EB0CB" wp14:editId="76F11A29">
             <wp:extent cx="5334000" cy="3790950"/>
             <wp:effectExtent l="0" t="0" r="0" b="0"/>
             <wp:docPr id="6" name="Imagen 6"/>
@@ -13764,7 +13722,7 @@
         <w:pStyle w:val="Ttulo3"/>
         <w:spacing w:before="240"/>
       </w:pPr>
-      <w:bookmarkStart w:id="25" w:name="_Toc240410599"/>
+      <w:bookmarkStart w:id="25" w:name="_Toc240564978"/>
       <w:r>
         <w:rPr>
           <w:b/>
@@ -13804,7 +13762,7 @@
           <w:noProof/>
         </w:rPr>
         <w:drawing>
-          <wp:inline distT="0" distB="0" distL="0" distR="0" wp14:anchorId="279D7BB2" wp14:editId="5F9F2DEF">
+          <wp:inline distT="0" distB="0" distL="0" distR="0" wp14:anchorId="1A857C80" wp14:editId="0E05F9AB">
             <wp:extent cx="4953000" cy="3629025"/>
             <wp:effectExtent l="0" t="0" r="0" b="0"/>
             <wp:docPr id="7" name="Imagen 7"/>
@@ -13866,7 +13824,7 @@
         <w:pStyle w:val="Ttulo3"/>
         <w:spacing w:before="240"/>
       </w:pPr>
-      <w:bookmarkStart w:id="26" w:name="_Toc240410600"/>
+      <w:bookmarkStart w:id="26" w:name="_Toc240564979"/>
       <w:r>
         <w:rPr>
           <w:b/>
@@ -13913,14 +13871,12 @@
         <w:pStyle w:val="Ttulo2"/>
         <w:spacing w:before="280"/>
       </w:pPr>
-      <w:bookmarkStart w:id="27" w:name="_Toc240410601"/>
+      <w:bookmarkStart w:id="27" w:name="_Toc240564980"/>
       <w:r>
         <w:rPr>
           <w:b/>
           <w:bCs/>
           <w:color w:val="1F3864"/>
-          <w:sz w:val="32"/>
-          <w:szCs w:val="32"/>
         </w:rPr>
         <w:t>4.4. Preprocesado de los datos</w:t>
       </w:r>
@@ -13950,7 +13906,7 @@
         <w:pStyle w:val="Ttulo3"/>
         <w:spacing w:before="240"/>
       </w:pPr>
-      <w:bookmarkStart w:id="28" w:name="_Toc240410602"/>
+      <w:bookmarkStart w:id="28" w:name="_Toc240564981"/>
       <w:r>
         <w:rPr>
           <w:b/>
@@ -13981,14 +13937,12 @@
         <w:pStyle w:val="Ttulo2"/>
         <w:spacing w:before="280"/>
       </w:pPr>
-      <w:bookmarkStart w:id="29" w:name="_Toc240410603"/>
+      <w:bookmarkStart w:id="29" w:name="_Toc240564982"/>
       <w:r>
         <w:rPr>
           <w:b/>
           <w:bCs/>
           <w:color w:val="1F3864"/>
-          <w:sz w:val="32"/>
-          <w:szCs w:val="32"/>
         </w:rPr>
         <w:t>4.5. Selección de variables</w:t>
       </w:r>
@@ -14015,7 +13969,7 @@
           <w:noProof/>
         </w:rPr>
         <w:drawing>
-          <wp:inline distT="0" distB="0" distL="0" distR="0" wp14:anchorId="78B21498" wp14:editId="62CD0533">
+          <wp:inline distT="0" distB="0" distL="0" distR="0" wp14:anchorId="1647CD52" wp14:editId="5B9C7F1B">
             <wp:extent cx="4572000" cy="4143375"/>
             <wp:effectExtent l="0" t="0" r="0" b="0"/>
             <wp:docPr id="8" name="Imagen 8"/>
@@ -14091,14 +14045,12 @@
         <w:pStyle w:val="Ttulo2"/>
         <w:spacing w:before="280"/>
       </w:pPr>
-      <w:bookmarkStart w:id="30" w:name="_Toc240410604"/>
+      <w:bookmarkStart w:id="30" w:name="_Toc240564983"/>
       <w:r>
         <w:rPr>
           <w:b/>
           <w:bCs/>
           <w:color w:val="1F3864"/>
-          <w:sz w:val="32"/>
-          <w:szCs w:val="32"/>
         </w:rPr>
         <w:t>4.6. Partición de los datos</w:t>
       </w:r>
@@ -14114,7 +14066,7 @@
         <w:pStyle w:val="Ttulo3"/>
         <w:spacing w:before="240"/>
       </w:pPr>
-      <w:bookmarkStart w:id="31" w:name="_Toc240410605"/>
+      <w:bookmarkStart w:id="31" w:name="_Toc240564984"/>
       <w:r>
         <w:rPr>
           <w:b/>
@@ -14141,7 +14093,7 @@
         <w:pStyle w:val="Ttulo3"/>
         <w:spacing w:before="240"/>
       </w:pPr>
-      <w:bookmarkStart w:id="32" w:name="_Toc240410606"/>
+      <w:bookmarkStart w:id="32" w:name="_Toc240564985"/>
       <w:r>
         <w:rPr>
           <w:b/>
@@ -14167,7 +14119,7 @@
           <w:noProof/>
         </w:rPr>
         <w:drawing>
-          <wp:inline distT="0" distB="0" distL="0" distR="0" wp14:anchorId="6E4D6AA3" wp14:editId="2B00EBBF">
+          <wp:inline distT="0" distB="0" distL="0" distR="0" wp14:anchorId="1DC5111E" wp14:editId="2C2E6B5D">
             <wp:extent cx="4762500" cy="3067050"/>
             <wp:effectExtent l="0" t="0" r="0" b="0"/>
             <wp:docPr id="9" name="Imagen 9"/>
@@ -14234,7 +14186,7 @@
         <w:pStyle w:val="Ttulo3"/>
         <w:spacing w:before="240"/>
       </w:pPr>
-      <w:bookmarkStart w:id="33" w:name="_Toc240410607"/>
+      <w:bookmarkStart w:id="33" w:name="_Toc240564986"/>
       <w:r>
         <w:rPr>
           <w:b/>
@@ -14614,7 +14566,7 @@
         <w:pStyle w:val="Ttulo3"/>
         <w:spacing w:before="240"/>
       </w:pPr>
-      <w:bookmarkStart w:id="34" w:name="_Toc240410608"/>
+      <w:bookmarkStart w:id="34" w:name="_Toc240564987"/>
       <w:r>
         <w:rPr>
           <w:b/>
@@ -14654,7 +14606,7 @@
           <w:noProof/>
         </w:rPr>
         <w:drawing>
-          <wp:inline distT="0" distB="0" distL="0" distR="0" wp14:anchorId="5D60D407" wp14:editId="66B301FB">
+          <wp:inline distT="0" distB="0" distL="0" distR="0" wp14:anchorId="0BD9A2DC" wp14:editId="37497DC1">
             <wp:extent cx="5524500" cy="2667000"/>
             <wp:effectExtent l="0" t="0" r="0" b="0"/>
             <wp:docPr id="10" name="Imagen 10"/>
@@ -14716,7 +14668,7 @@
         <w:pStyle w:val="Ttulo3"/>
         <w:spacing w:before="240"/>
       </w:pPr>
-      <w:bookmarkStart w:id="35" w:name="_Toc240410609"/>
+      <w:bookmarkStart w:id="35" w:name="_Toc240564988"/>
       <w:r>
         <w:rPr>
           <w:b/>
@@ -14756,7 +14708,7 @@
           <w:noProof/>
         </w:rPr>
         <w:drawing>
-          <wp:inline distT="0" distB="0" distL="0" distR="0" wp14:anchorId="7C5FFA88" wp14:editId="091B3962">
+          <wp:inline distT="0" distB="0" distL="0" distR="0" wp14:anchorId="196A38EC" wp14:editId="1B16671D">
             <wp:extent cx="4953000" cy="3048000"/>
             <wp:effectExtent l="0" t="0" r="0" b="0"/>
             <wp:docPr id="11" name="Imagen 11"/>
@@ -14823,14 +14775,12 @@
         <w:pStyle w:val="Ttulo2"/>
         <w:spacing w:before="280"/>
       </w:pPr>
-      <w:bookmarkStart w:id="36" w:name="_Toc240410610"/>
+      <w:bookmarkStart w:id="36" w:name="_Toc240564989"/>
       <w:r>
         <w:rPr>
           <w:b/>
           <w:bCs/>
           <w:color w:val="1F3864"/>
-          <w:sz w:val="32"/>
-          <w:szCs w:val="32"/>
         </w:rPr>
         <w:t>4.7. Aplicación de modelos de aprendizaje automático</w:t>
       </w:r>
@@ -14852,7 +14802,7 @@
         <w:pStyle w:val="Ttulo3"/>
         <w:spacing w:before="240"/>
       </w:pPr>
-      <w:bookmarkStart w:id="37" w:name="_Toc240410611"/>
+      <w:bookmarkStart w:id="37" w:name="_Toc240564990"/>
       <w:r>
         <w:rPr>
           <w:b/>
@@ -15334,7 +15284,7 @@
         <w:pStyle w:val="Ttulo3"/>
         <w:spacing w:before="240"/>
       </w:pPr>
-      <w:bookmarkStart w:id="38" w:name="_Toc240410612"/>
+      <w:bookmarkStart w:id="38" w:name="_Toc240564991"/>
       <w:r>
         <w:rPr>
           <w:b/>
@@ -15365,7 +15315,7 @@
           <w:noProof/>
         </w:rPr>
         <w:drawing>
-          <wp:inline distT="0" distB="0" distL="0" distR="0" wp14:anchorId="74750F62" wp14:editId="49DC17F0">
+          <wp:inline distT="0" distB="0" distL="0" distR="0" wp14:anchorId="457E91E9" wp14:editId="23B07156">
             <wp:extent cx="5524500" cy="2590800"/>
             <wp:effectExtent l="0" t="0" r="0" b="0"/>
             <wp:docPr id="12" name="Imagen 12"/>
@@ -16148,7 +16098,7 @@
         </w:rPr>
         <w:lastRenderedPageBreak/>
         <w:drawing>
-          <wp:inline distT="0" distB="0" distL="0" distR="0" wp14:anchorId="1B8F3D6A" wp14:editId="6133BC36">
+          <wp:inline distT="0" distB="0" distL="0" distR="0" wp14:anchorId="42F8B3FA" wp14:editId="5A1D5F73">
             <wp:extent cx="5143500" cy="3657600"/>
             <wp:effectExtent l="0" t="0" r="0" b="0"/>
             <wp:docPr id="13" name="Imagen 13"/>
@@ -16210,14 +16160,12 @@
         <w:pStyle w:val="Ttulo2"/>
         <w:spacing w:before="280"/>
       </w:pPr>
-      <w:bookmarkStart w:id="39" w:name="_Toc240410613"/>
+      <w:bookmarkStart w:id="39" w:name="_Toc240564992"/>
       <w:r>
         <w:rPr>
           <w:b/>
           <w:bCs/>
           <w:color w:val="1F3864"/>
-          <w:sz w:val="32"/>
-          <w:szCs w:val="32"/>
         </w:rPr>
         <w:t>4.8. Evaluación y validación de los modelos</w:t>
       </w:r>
@@ -16238,7 +16186,7 @@
         <w:pStyle w:val="Ttulo3"/>
         <w:spacing w:before="240"/>
       </w:pPr>
-      <w:bookmarkStart w:id="40" w:name="_Toc240410614"/>
+      <w:bookmarkStart w:id="40" w:name="_Toc240564993"/>
       <w:r>
         <w:rPr>
           <w:b/>
@@ -16774,7 +16722,7 @@
           <w:noProof/>
         </w:rPr>
         <w:drawing>
-          <wp:inline distT="0" distB="0" distL="0" distR="0" wp14:anchorId="18C84002" wp14:editId="554C3EC7">
+          <wp:inline distT="0" distB="0" distL="0" distR="0" wp14:anchorId="33E3B29E" wp14:editId="41482A32">
             <wp:extent cx="5524500" cy="2543175"/>
             <wp:effectExtent l="0" t="0" r="0" b="0"/>
             <wp:docPr id="14" name="Imagen 14"/>
@@ -16837,7 +16785,7 @@
         <w:pStyle w:val="Ttulo3"/>
         <w:spacing w:before="240"/>
       </w:pPr>
-      <w:bookmarkStart w:id="41" w:name="_Toc240410615"/>
+      <w:bookmarkStart w:id="41" w:name="_Toc240564994"/>
       <w:r>
         <w:rPr>
           <w:b/>
@@ -16863,7 +16811,7 @@
           <w:noProof/>
         </w:rPr>
         <w:drawing>
-          <wp:inline distT="0" distB="0" distL="0" distR="0" wp14:anchorId="69113F04" wp14:editId="55AB7DC7">
+          <wp:inline distT="0" distB="0" distL="0" distR="0" wp14:anchorId="08878EFE" wp14:editId="53855D0C">
             <wp:extent cx="5524500" cy="2371725"/>
             <wp:effectExtent l="0" t="0" r="0" b="0"/>
             <wp:docPr id="15" name="Imagen 15"/>
@@ -16944,7 +16892,7 @@
         <w:pStyle w:val="Ttulo3"/>
         <w:spacing w:before="240"/>
       </w:pPr>
-      <w:bookmarkStart w:id="42" w:name="_Toc240410616"/>
+      <w:bookmarkStart w:id="42" w:name="_Toc240564995"/>
       <w:r>
         <w:rPr>
           <w:b/>
@@ -17661,7 +17609,7 @@
         </w:rPr>
         <w:lastRenderedPageBreak/>
         <w:drawing>
-          <wp:inline distT="0" distB="0" distL="0" distR="0" wp14:anchorId="2F0528C4" wp14:editId="73F9A923">
+          <wp:inline distT="0" distB="0" distL="0" distR="0" wp14:anchorId="3E4F66BB" wp14:editId="0724F7D1">
             <wp:extent cx="5334000" cy="3324225"/>
             <wp:effectExtent l="0" t="0" r="0" b="0"/>
             <wp:docPr id="16" name="Imagen 16"/>
@@ -17734,7 +17682,7 @@
         </w:rPr>
         <w:lastRenderedPageBreak/>
         <w:drawing>
-          <wp:inline distT="0" distB="0" distL="0" distR="0" wp14:anchorId="4BDA9DEC" wp14:editId="1CE94A77">
+          <wp:inline distT="0" distB="0" distL="0" distR="0" wp14:anchorId="3043C546" wp14:editId="32F3D8AF">
             <wp:extent cx="4953000" cy="3590925"/>
             <wp:effectExtent l="0" t="0" r="0" b="0"/>
             <wp:docPr id="17" name="Imagen 17"/>
@@ -17806,14 +17754,12 @@
         <w:pStyle w:val="Ttulo2"/>
         <w:spacing w:before="280"/>
       </w:pPr>
-      <w:bookmarkStart w:id="43" w:name="_Toc240410617"/>
+      <w:bookmarkStart w:id="43" w:name="_Toc240564996"/>
       <w:r>
         <w:rPr>
           <w:b/>
           <w:bCs/>
           <w:color w:val="1F3864"/>
-          <w:sz w:val="32"/>
-          <w:szCs w:val="32"/>
         </w:rPr>
         <w:lastRenderedPageBreak/>
         <w:t>4.9. Comparativa de resultados</w:t>
@@ -18460,14 +18406,12 @@
         <w:pageBreakBefore/>
         <w:spacing w:after="240"/>
       </w:pPr>
-      <w:bookmarkStart w:id="44" w:name="_Toc240410618"/>
+      <w:bookmarkStart w:id="44" w:name="_Toc240564997"/>
       <w:r>
         <w:rPr>
           <w:b/>
           <w:bCs/>
           <w:color w:val="1F3864"/>
-          <w:sz w:val="36"/>
-          <w:szCs w:val="36"/>
         </w:rPr>
         <w:lastRenderedPageBreak/>
         <w:t>5. Conclusiones</w:t>
@@ -18484,14 +18428,12 @@
         <w:pStyle w:val="Ttulo2"/>
         <w:spacing w:before="280"/>
       </w:pPr>
-      <w:bookmarkStart w:id="45" w:name="_Toc240410619"/>
+      <w:bookmarkStart w:id="45" w:name="_Toc240564998"/>
       <w:r>
         <w:rPr>
           <w:b/>
           <w:bCs/>
           <w:color w:val="1F3864"/>
-          <w:sz w:val="32"/>
-          <w:szCs w:val="32"/>
         </w:rPr>
         <w:t>5.1. Sobre el proceso de adquisición y preparación</w:t>
       </w:r>
@@ -18517,14 +18459,12 @@
         <w:pStyle w:val="Ttulo2"/>
         <w:spacing w:before="280"/>
       </w:pPr>
-      <w:bookmarkStart w:id="46" w:name="_Toc240410620"/>
+      <w:bookmarkStart w:id="46" w:name="_Toc240564999"/>
       <w:r>
         <w:rPr>
           <w:b/>
           <w:bCs/>
           <w:color w:val="1F3864"/>
-          <w:sz w:val="32"/>
-          <w:szCs w:val="32"/>
         </w:rPr>
         <w:t>5.2. Sobre el análisis exploratorio</w:t>
       </w:r>
@@ -18550,14 +18490,12 @@
         <w:pStyle w:val="Ttulo2"/>
         <w:spacing w:before="280"/>
       </w:pPr>
-      <w:bookmarkStart w:id="47" w:name="_Toc240410621"/>
+      <w:bookmarkStart w:id="47" w:name="_Toc240565000"/>
       <w:r>
         <w:rPr>
           <w:b/>
           <w:bCs/>
           <w:color w:val="1F3864"/>
-          <w:sz w:val="32"/>
-          <w:szCs w:val="32"/>
         </w:rPr>
         <w:lastRenderedPageBreak/>
         <w:t>5.3. Sobre los contrastes estadísticos</w:t>
@@ -18579,14 +18517,12 @@
         <w:pStyle w:val="Ttulo2"/>
         <w:spacing w:before="280"/>
       </w:pPr>
-      <w:bookmarkStart w:id="48" w:name="_Toc240410622"/>
+      <w:bookmarkStart w:id="48" w:name="_Toc240565001"/>
       <w:r>
         <w:rPr>
           <w:b/>
           <w:bCs/>
           <w:color w:val="1F3864"/>
-          <w:sz w:val="32"/>
-          <w:szCs w:val="32"/>
         </w:rPr>
         <w:t>5.4. Sobre los modelos de regresión</w:t>
       </w:r>
@@ -18612,14 +18548,12 @@
         <w:pStyle w:val="Ttulo2"/>
         <w:spacing w:before="280"/>
       </w:pPr>
-      <w:bookmarkStart w:id="49" w:name="_Toc240410623"/>
+      <w:bookmarkStart w:id="49" w:name="_Toc240565002"/>
       <w:r>
         <w:rPr>
           <w:b/>
           <w:bCs/>
           <w:color w:val="1F3864"/>
-          <w:sz w:val="32"/>
-          <w:szCs w:val="32"/>
         </w:rPr>
         <w:t>5.5. Sobre la segmentación</w:t>
       </w:r>
@@ -18641,14 +18575,12 @@
         <w:pStyle w:val="Ttulo2"/>
         <w:spacing w:before="280"/>
       </w:pPr>
-      <w:bookmarkStart w:id="50" w:name="_Toc240410624"/>
+      <w:bookmarkStart w:id="50" w:name="_Toc240565003"/>
       <w:r>
         <w:rPr>
           <w:b/>
           <w:bCs/>
           <w:color w:val="1F3864"/>
-          <w:sz w:val="32"/>
-          <w:szCs w:val="32"/>
         </w:rPr>
         <w:t>5.6. Sobre la lectura regulatoria</w:t>
       </w:r>
@@ -18684,14 +18616,12 @@
         <w:pStyle w:val="Ttulo2"/>
         <w:spacing w:before="280"/>
       </w:pPr>
-      <w:bookmarkStart w:id="51" w:name="_Toc240410625"/>
+      <w:bookmarkStart w:id="51" w:name="_Toc240565004"/>
       <w:r>
         <w:rPr>
           <w:b/>
           <w:bCs/>
           <w:color w:val="1F3864"/>
-          <w:sz w:val="32"/>
-          <w:szCs w:val="32"/>
         </w:rPr>
         <w:t>5.7. Limitaciones</w:t>
       </w:r>
@@ -18723,14 +18653,12 @@
         <w:pStyle w:val="Ttulo2"/>
         <w:spacing w:before="280"/>
       </w:pPr>
-      <w:bookmarkStart w:id="52" w:name="_Toc240410626"/>
+      <w:bookmarkStart w:id="52" w:name="_Toc240565005"/>
       <w:r>
         <w:rPr>
           <w:b/>
           <w:bCs/>
           <w:color w:val="1F3864"/>
-          <w:sz w:val="32"/>
-          <w:szCs w:val="32"/>
         </w:rPr>
         <w:t>5.8. Líneas de desarrollo futuro</w:t>
       </w:r>
@@ -18757,14 +18685,12 @@
         <w:pageBreakBefore/>
         <w:spacing w:after="240"/>
       </w:pPr>
-      <w:bookmarkStart w:id="53" w:name="_Toc240410627"/>
+      <w:bookmarkStart w:id="53" w:name="_Toc240565006"/>
       <w:r>
         <w:rPr>
           <w:b/>
           <w:bCs/>
           <w:color w:val="1F3864"/>
-          <w:sz w:val="36"/>
-          <w:szCs w:val="36"/>
         </w:rPr>
         <w:lastRenderedPageBreak/>
         <w:t>6. Referencias bibliográficas</w:t>
@@ -18898,14 +18824,12 @@
         <w:pageBreakBefore/>
         <w:spacing w:after="240"/>
       </w:pPr>
-      <w:bookmarkStart w:id="54" w:name="_Toc240410628"/>
+      <w:bookmarkStart w:id="54" w:name="_Toc240565007"/>
       <w:r>
         <w:rPr>
           <w:b/>
           <w:bCs/>
           <w:color w:val="1F3864"/>
-          <w:sz w:val="36"/>
-          <w:szCs w:val="36"/>
         </w:rPr>
         <w:lastRenderedPageBreak/>
         <w:t>7. Anexos</w:t>
@@ -18917,14 +18841,12 @@
         <w:pStyle w:val="Ttulo2"/>
         <w:spacing w:before="280"/>
       </w:pPr>
-      <w:bookmarkStart w:id="55" w:name="_Toc240410629"/>
+      <w:bookmarkStart w:id="55" w:name="_Toc240565008"/>
       <w:r>
         <w:rPr>
           <w:b/>
           <w:bCs/>
           <w:color w:val="1F3864"/>
-          <w:sz w:val="32"/>
-          <w:szCs w:val="32"/>
         </w:rPr>
         <w:t>Anexo I. Cuadro de mando</w:t>
       </w:r>
@@ -18950,7 +18872,7 @@
           <w:noProof/>
         </w:rPr>
         <w:drawing>
-          <wp:inline distT="0" distB="0" distL="0" distR="0" wp14:anchorId="3CDA8801" wp14:editId="26A060DC">
+          <wp:inline distT="0" distB="0" distL="0" distR="0" wp14:anchorId="4FCC8BA3" wp14:editId="7515D2CA">
             <wp:extent cx="5715000" cy="3209925"/>
             <wp:effectExtent l="0" t="0" r="0" b="0"/>
             <wp:docPr id="18" name="Imagen 18"/>
@@ -19018,7 +18940,7 @@
         </w:rPr>
         <w:lastRenderedPageBreak/>
         <w:drawing>
-          <wp:inline distT="0" distB="0" distL="0" distR="0" wp14:anchorId="71B0B13C" wp14:editId="228C386B">
+          <wp:inline distT="0" distB="0" distL="0" distR="0" wp14:anchorId="614482C5" wp14:editId="1C59B548">
             <wp:extent cx="5715000" cy="3209925"/>
             <wp:effectExtent l="0" t="0" r="0" b="0"/>
             <wp:docPr id="19" name="Imagen 19"/>
@@ -19085,7 +19007,7 @@
           <w:noProof/>
         </w:rPr>
         <w:drawing>
-          <wp:inline distT="0" distB="0" distL="0" distR="0" wp14:anchorId="785D30D1" wp14:editId="2A26BADD">
+          <wp:inline distT="0" distB="0" distL="0" distR="0" wp14:anchorId="388C4C58" wp14:editId="7959A6DB">
             <wp:extent cx="5715000" cy="3209925"/>
             <wp:effectExtent l="0" t="0" r="0" b="0"/>
             <wp:docPr id="20" name="Imagen 20"/>
@@ -19148,14 +19070,12 @@
         <w:pStyle w:val="Ttulo2"/>
         <w:spacing w:before="280"/>
       </w:pPr>
-      <w:bookmarkStart w:id="56" w:name="_Toc240410630"/>
+      <w:bookmarkStart w:id="56" w:name="_Toc240565009"/>
       <w:r>
         <w:rPr>
           <w:b/>
           <w:bCs/>
           <w:color w:val="1F3864"/>
-          <w:sz w:val="32"/>
-          <w:szCs w:val="32"/>
         </w:rPr>
         <w:t>Anexo II. Informe de preprocesado</w:t>
       </w:r>
@@ -20739,8 +20659,8 @@
     </w:pPr>
     <w:rPr>
       <w:color w:val="2E74B5"/>
-      <w:sz w:val="32"/>
-      <w:szCs w:val="32"/>
+      <w:sz w:val="36"/>
+      <w:szCs w:val="36"/>
     </w:rPr>
   </w:style>
   <w:style w:type="paragraph" w:styleId="Ttulo2">
@@ -20753,8 +20673,8 @@
     </w:pPr>
     <w:rPr>
       <w:color w:val="2E74B5"/>
-      <w:sz w:val="26"/>
-      <w:szCs w:val="26"/>
+      <w:sz w:val="32"/>
+      <w:szCs w:val="32"/>
     </w:rPr>
   </w:style>
   <w:style w:type="paragraph" w:styleId="Ttulo3">

</xml_diff>